<commit_message>
Merge Quiénes Somos into Acerca de ADC; remove Quiénes Somos from nav on all pages
Co-Authored-By: Claude Sonnet 4.6 <noreply@anthropic.com>
</commit_message>
<xml_diff>
--- a/ADC_Calendario_ToDo.docx
+++ b/ADC_Calendario_ToDo.docx
@@ -25,8 +25,112 @@
         <w:pStyle w:val="ListBullet"/>
       </w:pPr>
       <w:r>
-        <w:t>Get google calendar link for refreshable portion on new website</w:t>
+        <w:t>1. Go to https://calendar.google.com and sign in with the ADC Google account</w:t>
       </w:r>
+    </w:p>
+    <w:p>
+      <w:pPr>
+        <w:pStyle w:val="ListBullet"/>
+        <w:rPr>
+          <w:rFonts w:hint="eastAsia"/>
+        </w:rPr>
+      </w:pPr>
+      <w:r>
+        <w:rPr>
+          <w:rFonts w:hint="eastAsia"/>
+        </w:rPr>
+        <w:t xml:space="preserve">  2. On the left, find the ADC calendar </w:t>
+      </w:r>
+      <w:r>
+        <w:rPr>
+          <w:rFonts w:hint="eastAsia"/>
+        </w:rPr>
+        <w:t>→</w:t>
+      </w:r>
+      <w:r>
+        <w:rPr>
+          <w:rFonts w:hint="eastAsia"/>
+        </w:rPr>
+        <w:t xml:space="preserve"> click the three dots next to it </w:t>
+      </w:r>
+      <w:r>
+        <w:rPr>
+          <w:rFonts w:hint="eastAsia"/>
+        </w:rPr>
+        <w:t>→</w:t>
+      </w:r>
+    </w:p>
+    <w:p>
+      <w:pPr>
+        <w:pStyle w:val="ListBullet"/>
+      </w:pPr>
+      <w:r>
+        <w:t xml:space="preserve">  Settings and sharing</w:t>
+      </w:r>
+    </w:p>
+    <w:p>
+      <w:pPr>
+        <w:pStyle w:val="ListBullet"/>
+      </w:pPr>
+      <w:r>
+        <w:t xml:space="preserve">  3. Scroll down to "Integrate calendar"</w:t>
+      </w:r>
+    </w:p>
+    <w:p>
+      <w:pPr>
+        <w:pStyle w:val="ListBullet"/>
+      </w:pPr>
+      <w:r>
+        <w:t xml:space="preserve">  4. Copy the Calendar ID (looks like ...@group.calendar.google.com) or copy the</w:t>
+      </w:r>
+    </w:p>
+    <w:p>
+      <w:pPr>
+        <w:pStyle w:val="ListBullet"/>
+      </w:pPr>
+      <w:r>
+        <w:t xml:space="preserve">   full embed code they provide</w:t>
+      </w:r>
+    </w:p>
+    <w:p>
+      <w:pPr>
+        <w:pStyle w:val="ListBullet"/>
+        <w:numPr>
+          <w:ilvl w:val="0"/>
+          <w:numId w:val="0"/>
+        </w:numPr>
+        <w:ind w:left="360" w:hanging="360"/>
+      </w:pPr>
+    </w:p>
+    <w:p>
+      <w:pPr>
+        <w:pStyle w:val="ListBullet"/>
+        <w:numPr>
+          <w:ilvl w:val="0"/>
+          <w:numId w:val="0"/>
+        </w:numPr>
+        <w:ind w:left="360" w:hanging="360"/>
+      </w:pPr>
+    </w:p>
+    <w:p>
+      <w:pPr>
+        <w:pStyle w:val="ListBullet"/>
+        <w:numPr>
+          <w:ilvl w:val="0"/>
+          <w:numId w:val="0"/>
+        </w:numPr>
+        <w:ind w:left="360" w:hanging="360"/>
+      </w:pPr>
+    </w:p>
+    <w:p>
+      <w:pPr>
+        <w:pStyle w:val="ListBullet"/>
+        <w:numPr>
+          <w:ilvl w:val="0"/>
+          <w:numId w:val="0"/>
+        </w:numPr>
+        <w:ind w:left="360" w:hanging="360"/>
+      </w:pPr>
     </w:p>
     <w:sectPr>
       <w:pgSz w:w="12240" w:h="15840"/>

</xml_diff>